<commit_message>
Innesto sistema paperless: visualizzazione/compilazione moduli in-app + marcatura documenti
</commit_message>
<xml_diff>
--- a/app/static/library/ambiente/manuale/MANUALE_ISO_14001_2015.docx
+++ b/app/static/library/ambiente/manuale/MANUALE_ISO_14001_2015.docx
@@ -35707,12 +35707,9 @@
     </w:tr>
   </w:tbl>
   <w:p>
-    <w:pPr>
-      <w:pStyle w:val="Pidipagina"/>
-      <w:rPr>
-        <w:lang w:val="en-US"/>
-      </w:rPr>
-    </w:pPr>
+    <w:r>
+      <w:t>MasterComplianceHSQE by Maurizio Gustinicchi Consulting</w:t>
+    </w:r>
   </w:p>
 </w:ftr>
 </file>

</xml_diff>